<commit_message>
Set Python version to 3.11
</commit_message>
<xml_diff>
--- a/Khla_Si_Ko_Game_Documentation.docx
+++ b/Khla_Si_Ko_Game_Documentation.docx
@@ -246,13 +246,7 @@
               <w:rPr>
                 <w:sz w:val="16"/>
               </w:rPr>
-              <w:t>Two</w:t>
-            </w:r>
-            <w:r>
-              <w:rPr>
-                <w:sz w:val="16"/>
-              </w:rPr>
-              <w:t xml:space="preserve"> local players, or one player against the computer</w:t>
+              <w:t>Two local players, or one player against the computer</w:t>
             </w:r>
           </w:p>
         </w:tc>
@@ -312,7 +306,13 @@
               <w:rPr>
                 <w:sz w:val="16"/>
               </w:rPr>
-              <w:t>4 ? 4 board; 4 Tigers and up to 12 Cows</w:t>
+              <w:t xml:space="preserve">4 * </w:t>
+            </w:r>
+            <w:r>
+              <w:rPr>
+                <w:sz w:val="16"/>
+              </w:rPr>
+              <w:t>4 board; 4 Tigers and up to 12 Cows</w:t>
             </w:r>
           </w:p>
         </w:tc>
@@ -462,14 +462,7 @@
                 <w:b/>
                 <w:sz w:val="16"/>
               </w:rPr>
-              <w:t>D</w:t>
-            </w:r>
-            <w:r>
-              <w:rPr>
-                <w:b/>
-                <w:sz w:val="16"/>
-              </w:rPr>
-              <w:t>ocument version</w:t>
+              <w:t>Document version</w:t>
             </w:r>
           </w:p>
         </w:tc>
@@ -497,8 +490,6 @@
               </w:rPr>
               <w:t xml:space="preserve">1.0  </w:t>
             </w:r>
-            <w:bookmarkStart w:id="0" w:name="_GoBack"/>
-            <w:bookmarkEnd w:id="0"/>
             <w:r>
               <w:rPr>
                 <w:sz w:val="16"/>
@@ -563,10 +554,7 @@
         <w:t xml:space="preserve">(Khla Si Ko, </w:t>
       </w:r>
       <w:r>
-        <w:t>Tiger Eats Cow?) is a turn-based board strategy game presented as a desktop application. The game combines a</w:t>
-      </w:r>
-      <w:r>
-        <w:t xml:space="preserve"> small, tactical board with camera-based hand interaction. Players can compete locally or play against a configurable computer opponent. Mouse input remains available as a practical alternative when camera control is unavailable.</w:t>
+        <w:t>Tiger Eats Cow?) is a turn-based board strategy game presented as a desktop application. The game combines a small, tactical board with camera-based hand interaction. Players can compete locally or play against a configurable computer opponent. Mouse input remains available as a practical alternative when camera control is unavailable.</w:t>
       </w:r>
     </w:p>
     <w:p>
@@ -576,10 +564,7 @@
         </w:rPr>
       </w:pPr>
       <w:r>
-        <w:t>The application is impleme</w:t>
-      </w:r>
-      <w:r>
-        <w:t>nted in Python. Pygame presents the game window and handles interaction and sound, while MediaPipe identifies hand landmarks in webcam frames. A dedicated rules/state layer validates moves and decides game outcomes.</w:t>
+        <w:t>The application is implemented in Python. Pygame presents the game window and handles interaction and sound, while MediaPipe identifies hand landmarks in webcam frames. A dedicated rules/state layer validates moves and decides game outcomes.</w:t>
       </w:r>
     </w:p>
     <w:p>
@@ -599,10 +584,7 @@
         </w:rPr>
       </w:pPr>
       <w:r>
-        <w:t>Offer an accessible dig</w:t>
-      </w:r>
-      <w:r>
-        <w:t>ital version of a traditional Khmer-style Tiger-versus-Cow game.</w:t>
+        <w:t>Offer an accessible digital version of a traditional Khmer-style Tiger-versus-Cow game.</w:t>
       </w:r>
     </w:p>
     <w:p>
@@ -638,10 +620,7 @@
         </w:rPr>
       </w:pPr>
       <w:r>
-        <w:t>Support local two-</w:t>
-      </w:r>
-      <w:r>
-        <w:t>player play and a selectable AI opponent with several strengths.</w:t>
+        <w:t>Support local two-player play and a selectable AI opponent with several strengths.</w:t>
       </w:r>
     </w:p>
     <w:p>
@@ -858,13 +837,7 @@
               <w:rPr>
                 <w:sz w:val="16"/>
               </w:rPr>
-              <w:t xml:space="preserve">Four pieces placed in </w:t>
-            </w:r>
-            <w:r>
-              <w:rPr>
-                <w:sz w:val="16"/>
-              </w:rPr>
-              <w:t>the four corner cells at the start.</w:t>
+              <w:t>Four pieces placed in the four corner cells at the start.</w:t>
             </w:r>
           </w:p>
         </w:tc>
@@ -1100,13 +1073,7 @@
               <w:rPr>
                 <w:sz w:val="16"/>
               </w:rPr>
-              <w:t xml:space="preserve">Once all </w:t>
-            </w:r>
-            <w:r>
-              <w:rPr>
-                <w:sz w:val="16"/>
-              </w:rPr>
-              <w:t>12 Cows have entered the board, Cow moves one Cow orthogonally to an adjacent empty cell.</w:t>
+              <w:t>Once all 12 Cows have entered the board, Cow moves one Cow orthogonally to an adjacent empty cell.</w:t>
             </w:r>
           </w:p>
         </w:tc>
@@ -1157,10 +1124,7 @@
         </w:rPr>
       </w:pPr>
       <w:r>
-        <w:t xml:space="preserve">After all 12 have been placed, select a Cow and </w:t>
-      </w:r>
-      <w:r>
-        <w:t>move it one cell up, down, left or right into an empty cell.</w:t>
+        <w:t>After all 12 have been placed, select a Cow and move it one cell up, down, left or right into an empty cell.</w:t>
       </w:r>
     </w:p>
     <w:p>
@@ -1204,10 +1168,7 @@
         </w:rPr>
       </w:pPr>
       <w:r>
-        <w:t>Capture by jumping over an adja</w:t>
-      </w:r>
-      <w:r>
-        <w:t>cent Cow in a straight line to the empty cell immediately beyond it. The Cow is removed.</w:t>
+        <w:t>Capture by jumping over an adjacent Cow in a straight line to the empty cell immediately beyond it. The Cow is removed.</w:t>
       </w:r>
     </w:p>
     <w:p>
@@ -1237,10 +1198,7 @@
         </w:rPr>
       </w:pPr>
       <w:r>
-        <w:t>The game ends when a win conditio</w:t>
-      </w:r>
-      <w:r>
-        <w:t>n is reached, a player forfeits the current turn, or a draw condition is reported by the game. The winner panel identifies the result. Restart begins a fresh board with four corner Tigers and Cow to move.</w:t>
+        <w:t>The game ends when a win condition is reached, a player forfeits the current turn, or a draw condition is reported by the game. The winner panel identifies the result. Restart begins a fresh board with four corner Tigers and Cow to move.</w:t>
       </w:r>
     </w:p>
     <w:p>
@@ -1351,15 +1309,7 @@
                 <w:color w:val="FFFFFF"/>
                 <w:sz w:val="16"/>
               </w:rPr>
-              <w:t xml:space="preserve">Mouse / keyboard </w:t>
-            </w:r>
-            <w:r>
-              <w:rPr>
-                <w:b/>
-                <w:color w:val="FFFFFF"/>
-                <w:sz w:val="16"/>
-              </w:rPr>
-              <w:t>alternative</w:t>
+              <w:t>Mouse / keyboard alternative</w:t>
             </w:r>
           </w:p>
         </w:tc>
@@ -1419,7 +1369,20 @@
               <w:rPr>
                 <w:sz w:val="16"/>
               </w:rPr>
-              <w:t>On Cow?s turn, use the left hand on the right camera. Make a fist or pinch, point to an empty cell, then release.</w:t>
+              <w:t xml:space="preserve">On </w:t>
+            </w:r>
+            <w:r>
+              <w:rPr>
+                <w:rFonts w:hint="eastAsia"/>
+                <w:sz w:val="16"/>
+              </w:rPr>
+              <w:t>Cow's</w:t>
+            </w:r>
+            <w:r>
+              <w:rPr>
+                <w:sz w:val="16"/>
+              </w:rPr>
+              <w:t xml:space="preserve"> turn, use the left hand on the right camera. Make a fist or pinch, point to an empty cell, then release.</w:t>
             </w:r>
           </w:p>
         </w:tc>
@@ -1505,13 +1468,13 @@
               <w:rPr>
                 <w:sz w:val="16"/>
               </w:rPr>
-              <w:t xml:space="preserve">On Tiger?s turn, use the right hand on the left camera. Grab, point to a legal </w:t>
+              <w:t>On Tiger’</w:t>
             </w:r>
             <w:r>
               <w:rPr>
                 <w:sz w:val="16"/>
               </w:rPr>
-              <w:t>destination, then release.</w:t>
+              <w:t>s turn, use the right hand on the left camera. Grab, point to a legal destination, then release.</w:t>
             </w:r>
           </w:p>
         </w:tc>
@@ -1682,13 +1645,7 @@
               <w:rPr>
                 <w:sz w:val="16"/>
               </w:rPr>
-              <w:t xml:space="preserve">Make </w:t>
-            </w:r>
-            <w:r>
-              <w:rPr>
-                <w:sz w:val="16"/>
-              </w:rPr>
-              <w:t>a fist or pinch and release over Start Game.</w:t>
+              <w:t>Make a fist or pinch and release over Start Game.</w:t>
             </w:r>
           </w:p>
         </w:tc>
@@ -1830,11 +1787,14 @@
             </w:pPr>
             <w:r>
               <w:rPr>
+                <w:rFonts w:hint="eastAsia"/>
                 <w:b/>
                 <w:sz w:val="16"/>
               </w:rPr>
-              <w:t>Forfeit / restart</w:t>
+              <w:t>Forfeit/restart</w:t>
             </w:r>
+            <w:bookmarkStart w:id="0" w:name="_GoBack"/>
+            <w:bookmarkEnd w:id="0"/>
             <w:r>
               <w:rPr>
                 <w:b/>
@@ -1927,10 +1887,7 @@
         <w:pStyle w:val="Heading1"/>
       </w:pPr>
       <w:r>
-        <w:t xml:space="preserve">6. Functional Requirements and </w:t>
-      </w:r>
-      <w:r>
-        <w:t>Implemented Features</w:t>
+        <w:t>6. Functional Requirements and Implemented Features</w:t>
       </w:r>
     </w:p>
     <w:tbl>
@@ -2204,13 +2161,7 @@
               <w:rPr>
                 <w:sz w:val="16"/>
               </w:rPr>
-              <w:t>Track board occupancy, active turn, selected piece, placed/captured Cow counts</w:t>
-            </w:r>
-            <w:r>
-              <w:rPr>
-                <w:sz w:val="16"/>
-              </w:rPr>
-              <w:t xml:space="preserve"> and winner.</w:t>
+              <w:t>Track board occupancy, active turn, selected piece, placed/captured Cow counts and winner.</w:t>
             </w:r>
           </w:p>
         </w:tc>
@@ -2468,13 +2419,7 @@
               <w:rPr>
                 <w:sz w:val="16"/>
               </w:rPr>
-              <w:t xml:space="preserve">Use </w:t>
-            </w:r>
-            <w:r>
-              <w:rPr>
-                <w:sz w:val="16"/>
-              </w:rPr>
-              <w:t>MediaPipe Hand Landmarker and recognize fist/pinch grabs, releases and theme gestures.</w:t>
+              <w:t>Use MediaPipe Hand Landmarker and recognize fist/pinch grabs, releases and theme gestures.</w:t>
             </w:r>
           </w:p>
         </w:tc>
@@ -2645,13 +2590,7 @@
               <w:rPr>
                 <w:sz w:val="16"/>
               </w:rPr>
-              <w:t xml:space="preserve">Use alpha-beta search with Easy, Medium, Hard and </w:t>
-            </w:r>
-            <w:r>
-              <w:rPr>
-                <w:sz w:val="16"/>
-              </w:rPr>
-              <w:t>Master depths (1, 2, 3 and 5).</w:t>
+              <w:t>Use alpha-beta search with Easy, Medium, Hard and Master depths (1, 2, 3 and 5).</w:t>
             </w:r>
           </w:p>
         </w:tc>
@@ -2822,13 +2761,7 @@
               <w:rPr>
                 <w:sz w:val="16"/>
               </w:rPr>
-              <w:t xml:space="preserve">Play game music and move/result sounds; support custom music/player sounds, </w:t>
-            </w:r>
-            <w:r>
-              <w:rPr>
-                <w:sz w:val="16"/>
-              </w:rPr>
-              <w:t>pause, volume and mute settings.</w:t>
+              <w:t>Play game music and move/result sounds; support custom music/player sounds, pause, volume and mute settings.</w:t>
             </w:r>
           </w:p>
         </w:tc>
@@ -2943,10 +2876,7 @@
         </w:rPr>
       </w:pPr>
       <w:r>
-        <w:t xml:space="preserve">The game screen places Tiger?s camera preview on the left, the board centrally and </w:t>
-      </w:r>
-      <w:r>
-        <w:t>Cow?s preview on the right.</w:t>
+        <w:t>The game screen places Tiger?s camera preview on the left, the board centrally and Cow?s preview on the right.</w:t>
       </w:r>
     </w:p>
     <w:p>
@@ -2982,10 +2912,7 @@
         </w:rPr>
       </w:pPr>
       <w:r>
-        <w:t xml:space="preserve">Board colors can be changed among </w:t>
-      </w:r>
-      <w:r>
-        <w:t>Angkor Sandstone, Royal Crimson, Emerald Lotus and Moonstone Blue.</w:t>
+        <w:t>Board colors can be changed among Angkor Sandstone, Royal Crimson, Emerald Lotus and Moonstone Blue.</w:t>
       </w:r>
     </w:p>
     <w:p>
@@ -3138,13 +3065,7 @@
               <w:rPr>
                 <w:sz w:val="16"/>
               </w:rPr>
-              <w:t>Initiali</w:t>
-            </w:r>
-            <w:r>
-              <w:rPr>
-                <w:sz w:val="16"/>
-              </w:rPr>
-              <w:t>zes the app, reads events and coordinates the game loop, cameras, AI, renderer and sound.</w:t>
+              <w:t>Initializes the app, reads events and coordinates the game loop, cameras, AI, renderer and sound.</w:t>
             </w:r>
           </w:p>
         </w:tc>
@@ -3262,13 +3183,7 @@
               <w:rPr>
                 <w:sz w:val="16"/>
               </w:rPr>
-              <w:t xml:space="preserve">Owns match state and validates moves, </w:t>
-            </w:r>
-            <w:r>
-              <w:rPr>
-                <w:sz w:val="16"/>
-              </w:rPr>
-              <w:t>turn changes, captures, forfeits and outcomes.</w:t>
+              <w:t>Owns match state and validates moves, turn changes, captures, forfeits and outcomes.</w:t>
             </w:r>
           </w:p>
         </w:tc>
@@ -3359,7 +3274,6 @@
                 <w:b/>
                 <w:sz w:val="16"/>
               </w:rPr>
-              <w:lastRenderedPageBreak/>
               <w:t>src/camera.py / src/hand_tracker.py</w:t>
             </w:r>
           </w:p>
@@ -3387,13 +3301,14 @@
               <w:rPr>
                 <w:sz w:val="16"/>
               </w:rPr>
-              <w:t>Opens webcam devices, reads frames, detects hand landmarks and</w:t>
+              <w:t xml:space="preserve">Opens webcam devices, reads frames, detects hand landmarks and provides player hand </w:t>
             </w:r>
             <w:r>
               <w:rPr>
                 <w:sz w:val="16"/>
               </w:rPr>
-              <w:t xml:space="preserve"> provides player hand observations.</w:t>
+              <w:lastRenderedPageBreak/>
+              <w:t>observations.</w:t>
             </w:r>
           </w:p>
         </w:tc>
@@ -3425,6 +3340,7 @@
                 <w:b/>
                 <w:sz w:val="16"/>
               </w:rPr>
+              <w:lastRenderedPageBreak/>
               <w:t>src/ai_player.py</w:t>
             </w:r>
           </w:p>
@@ -3530,10 +3446,7 @@
         <w:pStyle w:val="Heading2"/>
       </w:pPr>
       <w:r>
-        <w:t xml:space="preserve">Typical </w:t>
-      </w:r>
-      <w:r>
-        <w:t>turn flow</w:t>
+        <w:t>Typical turn flow</w:t>
       </w:r>
     </w:p>
     <w:p>
@@ -3569,10 +3482,7 @@
         </w:rPr>
       </w:pPr>
       <w:r>
-        <w:t>The game-state layer checks whether the reques</w:t>
-      </w:r>
-      <w:r>
-        <w:t>ted placement, move or capture is legal.</w:t>
+        <w:t>The game-state layer checks whether the requested placement, move or capture is legal.</w:t>
       </w:r>
     </w:p>
     <w:p>
@@ -3604,10 +3514,7 @@
         <w:pStyle w:val="Heading1"/>
       </w:pPr>
       <w:r>
-        <w:t>9. Technology Stac</w:t>
-      </w:r>
-      <w:r>
-        <w:t>k</w:t>
+        <w:t>9. Technology Stack</w:t>
       </w:r>
     </w:p>
     <w:tbl>
@@ -3968,13 +3875,7 @@
               <w:rPr>
                 <w:sz w:val="16"/>
               </w:rPr>
-              <w:t xml:space="preserve">Hand landmark </w:t>
-            </w:r>
-            <w:r>
-              <w:rPr>
-                <w:sz w:val="16"/>
-              </w:rPr>
-              <w:t>detection and tracking from video frames.</w:t>
+              <w:t>Hand landmark detection and tracking from video frames.</w:t>
             </w:r>
           </w:p>
         </w:tc>
@@ -4164,10 +4065,7 @@
         <w:pStyle w:val="Heading1"/>
       </w:pPr>
       <w:r>
-        <w:t xml:space="preserve">10. </w:t>
-      </w:r>
-      <w:r>
-        <w:t>Installation and Running</w:t>
+        <w:t>10. Installation and Running</w:t>
       </w:r>
     </w:p>
     <w:p>
@@ -4211,15 +4109,7 @@
           <w:color w:val="397B68"/>
           <w:sz w:val="18"/>
         </w:rPr>
-        <w:t>.\.venv-game\Scripts\python.exe -m pip install</w:t>
-      </w:r>
-      <w:r>
-        <w:rPr>
-          <w:rFonts w:ascii="Consolas" w:hAnsi="Consolas"/>
-          <w:color w:val="397B68"/>
-          <w:sz w:val="18"/>
-        </w:rPr>
-        <w:t xml:space="preserve"> -r requirements.txt</w:t>
+        <w:t>.\.venv-game\Scripts\python.exe -m pip install -r requirements.txt</w:t>
       </w:r>
     </w:p>
     <w:p>
@@ -4246,10 +4136,7 @@
         </w:rPr>
       </w:pPr>
       <w:r>
-        <w:t>Connect webcams before launch and allow camera access when prompted. The application scans camera indices 0?5. If only one camera is found, both player previews can share it. If cameras are unava</w:t>
-      </w:r>
-      <w:r>
-        <w:t>ilable, use the mouse controls.</w:t>
+        <w:t>Connect webcams before launch and allow camera access when prompted. The application scans camera indices 0?5. If only one camera is found, both player previews can share it. If cameras are unavailable, use the mouse controls.</w:t>
       </w:r>
     </w:p>
     <w:p>
@@ -4267,10 +4154,7 @@
         </w:rPr>
       </w:pPr>
       <w:r>
-        <w:t>The repository includes Python unit tests for rules, AI decisions, gesture recognition, dual-camera behavior, player names, sound settings, click sounds and winner sounds. Run the complete t</w:t>
-      </w:r>
-      <w:r>
-        <w:t>est suite from the project directory:</w:t>
+        <w:t>The repository includes Python unit tests for rules, AI decisions, gesture recognition, dual-camera behavior, player names, sound settings, click sounds and winner sounds. Run the complete test suite from the project directory:</w:t>
       </w:r>
     </w:p>
     <w:p>
@@ -4595,13 +4479,7 @@
               <w:rPr>
                 <w:sz w:val="16"/>
               </w:rPr>
-              <w:t>A legal move is applied at supported search depths without changing unrelated state</w:t>
-            </w:r>
-            <w:r>
-              <w:rPr>
-                <w:sz w:val="16"/>
-              </w:rPr>
-              <w:t>.</w:t>
+              <w:t>A legal move is applied at supported search depths without changing unrelated state.</w:t>
             </w:r>
           </w:p>
         </w:tc>
@@ -4693,10 +4571,7 @@
         </w:rPr>
       </w:pPr>
       <w:r>
-        <w:t>Camera access is used for live hand tracking. The documented desktop workflow does not require a touchscreen or game</w:t>
-      </w:r>
-      <w:r>
-        <w:t xml:space="preserve"> controller.</w:t>
+        <w:t>Camera access is used for live hand tracking. The documented desktop workflow does not require a touchscreen or game controller.</w:t>
       </w:r>
     </w:p>
     <w:p>
@@ -4732,10 +4607,7 @@
         </w:rPr>
       </w:pPr>
       <w:r>
-        <w:t>The ga</w:t>
-      </w:r>
-      <w:r>
-        <w:t>me requires its included hand-landmarker model and image/audio assets to be available in the project assets folder.</w:t>
+        <w:t>The game requires its included hand-landmarker model and image/audio assets to be available in the project assets folder.</w:t>
       </w:r>
     </w:p>
     <w:p>
@@ -5064,13 +4936,7 @@
               <w:rPr>
                 <w:sz w:val="16"/>
               </w:rPr>
-              <w:t xml:space="preserve">Board/piece/interface imagery and </w:t>
-            </w:r>
-            <w:r>
-              <w:rPr>
-                <w:sz w:val="16"/>
-              </w:rPr>
-              <w:t>backgrounds.</w:t>
+              <w:t>Board/piece/interface imagery and backgrounds.</w:t>
             </w:r>
           </w:p>
         </w:tc>
@@ -5279,10 +5145,7 @@
         </w:rPr>
       </w:pPr>
       <w:r>
-        <w:t>The game starts with four Tigers in the</w:t>
-      </w:r>
-      <w:r>
-        <w:t xml:space="preserve"> corners of a 4 ? 4 board and Cow to move.</w:t>
+        <w:t>The game starts with four Tigers in the corners of a 4 ? 4 board and Cow to move.</w:t>
       </w:r>
     </w:p>
     <w:p>
@@ -5318,10 +5181,7 @@
         </w:rPr>
       </w:pPr>
       <w:r>
-        <w:t>H</w:t>
-      </w:r>
-      <w:r>
-        <w:t>and gestures can control actions when tracking is available, and mouse input supports gameplay without a working camera.</w:t>
+        <w:t>Hand gestures can control actions when tracking is available, and mouse input supports gameplay without a working camera.</w:t>
       </w:r>
     </w:p>
     <w:p>
@@ -5345,10 +5205,7 @@
         </w:rPr>
       </w:pPr>
       <w:r>
-        <w:t>The automated tests com</w:t>
-      </w:r>
-      <w:r>
-        <w:t>plete successfully using the documented command.</w:t>
+        <w:t>The automated tests complete successfully using the documented command.</w:t>
       </w:r>
     </w:p>
     <w:p>
@@ -5366,10 +5223,7 @@
         </w:rPr>
       </w:pPr>
       <w:r>
-        <w:t>The following are potential extensions rather than claims about current behavior: add a first-run interactive tutorial, provide additional camera calibration guidance, suppor</w:t>
-      </w:r>
-      <w:r>
-        <w:t>t more board layouts or AI strategies, and publish a packaged installer for easier distribution.</w:t>
+        <w:t>The following are potential extensions rather than claims about current behavior: add a first-run interactive tutorial, provide additional camera calibration guidance, support more board layouts or AI strategies, and publish a packaged installer for easier distribution.</w:t>
       </w:r>
     </w:p>
     <w:p>
@@ -5387,10 +5241,7 @@
         </w:rPr>
       </w:pPr>
       <w:r>
-        <w:t xml:space="preserve">This document reflects the checked-in project source and its README. Key implementation files include src/game_rules.py, src/game_state.py, </w:t>
-      </w:r>
-      <w:r>
-        <w:t>src/gesture_recognizer.py, src/hand_tracker.py, src/camera.py, src/ai_player.py, src/renderer.py and src/sound_effects.py. Run the application from the repository root so relative assets and model paths resolve correctly.</w:t>
+        <w:t>This document reflects the checked-in project source and its README. Key implementation files include src/game_rules.py, src/game_state.py, src/gesture_recognizer.py, src/hand_tracker.py, src/camera.py, src/ai_player.py, src/renderer.py and src/sound_effects.py. Run the application from the repository root so relative assets and model paths resolve correctly.</w:t>
       </w:r>
     </w:p>
     <w:sectPr>
@@ -5460,9 +5311,6 @@
       <w:instrText>PAGE</w:instrText>
     </w:r>
     <w:r>
-      <w:rPr>
-        <w:rFonts w:hint="eastAsia"/>
-      </w:rPr>
       <w:fldChar w:fldCharType="separate"/>
     </w:r>
     <w:r>
@@ -5470,7 +5318,7 @@
         <w:rFonts w:hint="eastAsia"/>
         <w:noProof/>
       </w:rPr>
-      <w:t>1</w:t>
+      <w:t>3</w:t>
     </w:r>
     <w:r>
       <w:fldChar w:fldCharType="end"/>
@@ -17447,7 +17295,7 @@
 </file>
 
 <file path=customXml/itemProps1.xml><?xml version="1.0" encoding="utf-8"?>
-<ds:datastoreItem xmlns:ds="http://schemas.openxmlformats.org/officeDocument/2006/customXml" ds:itemID="{95E434AF-00D6-4549-B3E2-FF05A6F52C82}">
+<ds:datastoreItem xmlns:ds="http://schemas.openxmlformats.org/officeDocument/2006/customXml" ds:itemID="{DBBB5463-E2D0-485A-AD6C-F25BDD855DA1}">
   <ds:schemaRefs>
     <ds:schemaRef ds:uri="http://schemas.openxmlformats.org/officeDocument/2006/bibliography"/>
   </ds:schemaRefs>

</xml_diff>

<commit_message>
Add command can know the code and create user flow
</commit_message>
<xml_diff>
--- a/Khla_Si_Ko_Game_Documentation.docx
+++ b/Khla_Si_Ko_Game_Documentation.docx
@@ -16,7 +16,12 @@
         <w:jc w:val="center"/>
       </w:pPr>
       <w:r>
-        <w:t>Tiger vs Cow</w:t>
+        <w:t>KLA</w:t>
+      </w:r>
+      <w:bookmarkStart w:id="0" w:name="_GoBack"/>
+      <w:bookmarkEnd w:id="0"/>
+      <w:r>
+        <w:t xml:space="preserve"> C KO</w:t>
       </w:r>
     </w:p>
     <w:p>
@@ -1793,8 +1798,6 @@
               </w:rPr>
               <w:t>Forfeit/restart</w:t>
             </w:r>
-            <w:bookmarkStart w:id="0" w:name="_GoBack"/>
-            <w:bookmarkEnd w:id="0"/>
             <w:r>
               <w:rPr>
                 <w:b/>
@@ -5318,7 +5321,7 @@
         <w:rFonts w:hint="eastAsia"/>
         <w:noProof/>
       </w:rPr>
-      <w:t>3</w:t>
+      <w:t>5</w:t>
     </w:r>
     <w:r>
       <w:fldChar w:fldCharType="end"/>
@@ -17295,7 +17298,7 @@
 </file>
 
 <file path=customXml/itemProps1.xml><?xml version="1.0" encoding="utf-8"?>
-<ds:datastoreItem xmlns:ds="http://schemas.openxmlformats.org/officeDocument/2006/customXml" ds:itemID="{DBBB5463-E2D0-485A-AD6C-F25BDD855DA1}">
+<ds:datastoreItem xmlns:ds="http://schemas.openxmlformats.org/officeDocument/2006/customXml" ds:itemID="{BDAA3D0A-5303-430A-8C53-8A71F29CDA1B}">
   <ds:schemaRefs>
     <ds:schemaRef ds:uri="http://schemas.openxmlformats.org/officeDocument/2006/bibliography"/>
   </ds:schemaRefs>

</xml_diff>